<commit_message>
docs: add report front matter to generated docx
</commit_message>
<xml_diff>
--- a/docs/DITTO_Project_Report.docx
+++ b/docs/DITTO_Project_Report.docx
@@ -2,6 +2,1248 @@
 <file path=word/document.xml><?xml version="1.0" encoding="utf-8"?>
 <w:document xmlns:wpc="http://schemas.microsoft.com/office/word/2010/wordprocessingCanvas" xmlns:mc="http://schemas.openxmlformats.org/markup-compatibility/2006" xmlns:o="urn:schemas-microsoft-com:office:office" xmlns:r="http://schemas.openxmlformats.org/officeDocument/2006/relationships" xmlns:m="http://schemas.openxmlformats.org/officeDocument/2006/math" xmlns:v="urn:schemas-microsoft-com:vml" xmlns:wp14="http://schemas.microsoft.com/office/word/2010/wordprocessingDrawing" xmlns:wp="http://schemas.openxmlformats.org/drawingml/2006/wordprocessingDrawing" xmlns:w10="urn:schemas-microsoft-com:office:word" xmlns:w="http://schemas.openxmlformats.org/wordprocessingml/2006/main" xmlns:w14="http://schemas.microsoft.com/office/word/2010/wordml" xmlns:w15="http://schemas.microsoft.com/office/word/2012/wordml" xmlns:wpg="http://schemas.microsoft.com/office/word/2010/wordprocessingGroup" xmlns:wpi="http://schemas.microsoft.com/office/word/2010/wordprocessingInk" xmlns:wne="http://schemas.microsoft.com/office/word/2006/wordml" xmlns:wps="http://schemas.microsoft.com/office/word/2010/wordprocessingShape" xmlns:cx="http://schemas.microsoft.com/office/drawing/2014/chartex" xmlns:cx1="http://schemas.microsoft.com/office/drawing/2015/9/8/chartex" xmlns:cx2="http://schemas.microsoft.com/office/drawing/2015/10/21/chartex" xmlns:cx3="http://schemas.microsoft.com/office/drawing/2016/5/9/chartex" xmlns:cx4="http://schemas.microsoft.com/office/drawing/2016/5/10/chartex" xmlns:cx5="http://schemas.microsoft.com/office/drawing/2016/5/11/chartex" xmlns:cx6="http://schemas.microsoft.com/office/drawing/2016/5/12/chartex" xmlns:cx7="http://schemas.microsoft.com/office/drawing/2016/5/13/chartex" xmlns:cx8="http://schemas.microsoft.com/office/drawing/2016/5/14/chartex" xmlns:aink="http://schemas.microsoft.com/office/drawing/2016/ink" xmlns:am3d="http://schemas.microsoft.com/office/drawing/2017/model3d" xmlns:w16cex="http://schemas.microsoft.com/office/word/2018/wordml/cex" xmlns:w16cid="http://schemas.microsoft.com/office/word/2016/wordml/cid" xmlns:w16="http://schemas.microsoft.com/office/word/2018/wordml" xmlns:w16sdtdh="http://schemas.microsoft.com/office/word/2020/wordml/sdtdatahash" xmlns:w16se="http://schemas.microsoft.com/office/word/2015/wordml/symex" mc:Ignorable="w14 w15 wp14">
   <w:body>
+    <w:p>
+      <w:pPr>
+        <w:spacing w:after="0" w:before="1440"/>
+      </w:pPr>
+    </w:p>
+    <w:p>
+      <w:pPr>
+        <w:spacing w:after="240" w:before="0" w:line="276"/>
+        <w:jc w:val="center"/>
+      </w:pPr>
+      <w:r>
+        <w:rPr>
+          <w:rFonts w:ascii="Times New Roman" w:cs="Times New Roman" w:eastAsia="Times New Roman" w:hAnsi="Times New Roman"/>
+          <w:b/>
+          <w:bCs/>
+          <w:sz w:val="28"/>
+          <w:szCs w:val="28"/>
+        </w:rPr>
+        <w:t xml:space="preserve">MCA MINI PROJECT REPORT</w:t>
+      </w:r>
+    </w:p>
+    <w:p>
+      <w:pPr>
+        <w:spacing w:after="240" w:before="0" w:line="276"/>
+        <w:jc w:val="center"/>
+      </w:pPr>
+      <w:r>
+        <w:rPr>
+          <w:rFonts w:ascii="Times New Roman" w:cs="Times New Roman" w:eastAsia="Times New Roman" w:hAnsi="Times New Roman"/>
+          <w:b/>
+          <w:bCs/>
+          <w:sz w:val="28"/>
+          <w:szCs w:val="28"/>
+        </w:rPr>
+        <w:t xml:space="preserve">ON</w:t>
+      </w:r>
+    </w:p>
+    <w:p>
+      <w:pPr>
+        <w:spacing w:after="480" w:before="0" w:line="276"/>
+        <w:jc w:val="center"/>
+      </w:pPr>
+      <w:r>
+        <w:rPr>
+          <w:rFonts w:ascii="Times New Roman" w:cs="Times New Roman" w:eastAsia="Times New Roman" w:hAnsi="Times New Roman"/>
+          <w:b/>
+          <w:bCs/>
+          <w:sz w:val="28"/>
+          <w:szCs w:val="28"/>
+        </w:rPr>
+        <w:t xml:space="preserve">"DITTO — DIGITAL TWIN STUDIO"</w:t>
+      </w:r>
+    </w:p>
+    <w:p>
+      <w:pPr>
+        <w:spacing w:after="0" w:before="0" w:line="276"/>
+        <w:jc w:val="center"/>
+      </w:pPr>
+      <w:r>
+        <w:rPr>
+          <w:rFonts w:ascii="Times New Roman" w:cs="Times New Roman" w:eastAsia="Times New Roman" w:hAnsi="Times New Roman"/>
+          <w:b w:val="false"/>
+          <w:bCs w:val="false"/>
+          <w:sz w:val="24"/>
+          <w:szCs w:val="24"/>
+        </w:rPr>
+        <w:t xml:space="preserve">Submitted in partial fulfillment of the requirements</w:t>
+      </w:r>
+    </w:p>
+    <w:p>
+      <w:pPr>
+        <w:spacing w:after="240" w:before="0" w:line="276"/>
+        <w:jc w:val="center"/>
+      </w:pPr>
+      <w:r>
+        <w:rPr>
+          <w:rFonts w:ascii="Times New Roman" w:cs="Times New Roman" w:eastAsia="Times New Roman" w:hAnsi="Times New Roman"/>
+          <w:b w:val="false"/>
+          <w:bCs w:val="false"/>
+          <w:sz w:val="24"/>
+          <w:szCs w:val="24"/>
+        </w:rPr>
+        <w:t xml:space="preserve">for the award of the degree of</w:t>
+      </w:r>
+    </w:p>
+    <w:p>
+      <w:pPr>
+        <w:spacing w:after="480" w:before="0" w:line="276"/>
+        <w:jc w:val="center"/>
+      </w:pPr>
+      <w:r>
+        <w:rPr>
+          <w:rFonts w:ascii="Times New Roman" w:cs="Times New Roman" w:eastAsia="Times New Roman" w:hAnsi="Times New Roman"/>
+          <w:b w:val="false"/>
+          <w:bCs w:val="false"/>
+          <w:sz w:val="24"/>
+          <w:szCs w:val="24"/>
+        </w:rPr>
+        <w:t xml:space="preserve">MASTER OF COMPUTER APPLICATIONS (MCA)</w:t>
+      </w:r>
+    </w:p>
+    <w:p>
+      <w:pPr>
+        <w:spacing w:after="240" w:before="0" w:line="276"/>
+        <w:jc w:val="center"/>
+      </w:pPr>
+      <w:r>
+        <w:rPr>
+          <w:rFonts w:ascii="Times New Roman" w:cs="Times New Roman" w:eastAsia="Times New Roman" w:hAnsi="Times New Roman"/>
+          <w:b w:val="false"/>
+          <w:bCs w:val="false"/>
+          <w:sz w:val="24"/>
+          <w:szCs w:val="24"/>
+        </w:rPr>
+        <w:t xml:space="preserve">Submitted by</w:t>
+      </w:r>
+    </w:p>
+    <w:p>
+      <w:pPr>
+        <w:spacing w:after="0" w:before="0" w:line="276"/>
+        <w:jc w:val="center"/>
+      </w:pPr>
+      <w:r>
+        <w:rPr>
+          <w:rFonts w:ascii="Times New Roman" w:cs="Times New Roman" w:eastAsia="Times New Roman" w:hAnsi="Times New Roman"/>
+          <w:b/>
+          <w:bCs/>
+          <w:sz w:val="24"/>
+          <w:szCs w:val="24"/>
+        </w:rPr>
+        <w:t xml:space="preserve">SANTHOSHKUMAR S</w:t>
+      </w:r>
+    </w:p>
+    <w:p>
+      <w:pPr>
+        <w:spacing w:after="480" w:before="0" w:line="276"/>
+        <w:jc w:val="center"/>
+      </w:pPr>
+      <w:r>
+        <w:rPr>
+          <w:rFonts w:ascii="Times New Roman" w:cs="Times New Roman" w:eastAsia="Times New Roman" w:hAnsi="Times New Roman"/>
+          <w:b w:val="false"/>
+          <w:bCs w:val="false"/>
+          <w:sz w:val="24"/>
+          <w:szCs w:val="24"/>
+        </w:rPr>
+        <w:t xml:space="preserve">Register Number: 241MCAN0014</w:t>
+      </w:r>
+    </w:p>
+    <w:p>
+      <w:pPr>
+        <w:spacing w:after="240" w:before="0" w:line="276"/>
+        <w:jc w:val="center"/>
+      </w:pPr>
+      <w:r>
+        <w:rPr>
+          <w:rFonts w:ascii="Times New Roman" w:cs="Times New Roman" w:eastAsia="Times New Roman" w:hAnsi="Times New Roman"/>
+          <w:b w:val="false"/>
+          <w:bCs w:val="false"/>
+          <w:sz w:val="24"/>
+          <w:szCs w:val="24"/>
+        </w:rPr>
+        <w:t xml:space="preserve">Under the Guidance of</w:t>
+      </w:r>
+    </w:p>
+    <w:p>
+      <w:pPr>
+        <w:spacing w:after="0" w:before="0" w:line="276"/>
+        <w:jc w:val="center"/>
+      </w:pPr>
+      <w:r>
+        <w:rPr>
+          <w:rFonts w:ascii="Times New Roman" w:cs="Times New Roman" w:eastAsia="Times New Roman" w:hAnsi="Times New Roman"/>
+          <w:b/>
+          <w:bCs/>
+          <w:sz w:val="24"/>
+          <w:szCs w:val="24"/>
+        </w:rPr>
+        <w:t xml:space="preserve">Dr. D. Saraswathi</w:t>
+      </w:r>
+    </w:p>
+    <w:p>
+      <w:pPr>
+        <w:spacing w:after="0" w:before="0" w:line="276"/>
+        <w:jc w:val="center"/>
+      </w:pPr>
+      <w:r>
+        <w:rPr>
+          <w:rFonts w:ascii="Times New Roman" w:cs="Times New Roman" w:eastAsia="Times New Roman" w:hAnsi="Times New Roman"/>
+          <w:b w:val="false"/>
+          <w:bCs w:val="false"/>
+          <w:sz w:val="24"/>
+          <w:szCs w:val="24"/>
+        </w:rPr>
+        <w:t xml:space="preserve">Associate Professor</w:t>
+      </w:r>
+    </w:p>
+    <w:p>
+      <w:pPr>
+        <w:spacing w:after="600" w:before="0" w:line="276"/>
+        <w:jc w:val="center"/>
+      </w:pPr>
+      <w:r>
+        <w:rPr>
+          <w:rFonts w:ascii="Times New Roman" w:cs="Times New Roman" w:eastAsia="Times New Roman" w:hAnsi="Times New Roman"/>
+          <w:b w:val="false"/>
+          <w:bCs w:val="false"/>
+          <w:sz w:val="24"/>
+          <w:szCs w:val="24"/>
+        </w:rPr>
+        <w:t xml:space="preserve">Department of Computer Science</w:t>
+      </w:r>
+    </w:p>
+    <w:p>
+      <w:pPr>
+        <w:spacing w:after="0" w:before="0" w:line="276"/>
+        <w:jc w:val="center"/>
+      </w:pPr>
+      <w:r>
+        <w:rPr>
+          <w:rFonts w:ascii="Times New Roman" w:cs="Times New Roman" w:eastAsia="Times New Roman" w:hAnsi="Times New Roman"/>
+          <w:b/>
+          <w:bCs/>
+          <w:sz w:val="24"/>
+          <w:szCs w:val="24"/>
+        </w:rPr>
+        <w:t xml:space="preserve">DEPARTMENT OF COMPUTER APPLICATIONS</w:t>
+      </w:r>
+    </w:p>
+    <w:p>
+      <w:pPr>
+        <w:spacing w:after="0" w:before="0" w:line="276"/>
+        <w:jc w:val="center"/>
+      </w:pPr>
+      <w:r>
+        <w:rPr>
+          <w:rFonts w:ascii="Times New Roman" w:cs="Times New Roman" w:eastAsia="Times New Roman" w:hAnsi="Times New Roman"/>
+          <w:b/>
+          <w:bCs/>
+          <w:sz w:val="24"/>
+          <w:szCs w:val="24"/>
+        </w:rPr>
+        <w:t xml:space="preserve">BHARATHIAR UNIVERSITY</w:t>
+      </w:r>
+    </w:p>
+    <w:p>
+      <w:pPr>
+        <w:spacing w:after="0" w:before="0" w:line="276"/>
+        <w:jc w:val="center"/>
+      </w:pPr>
+      <w:r>
+        <w:rPr>
+          <w:rFonts w:ascii="Times New Roman" w:cs="Times New Roman" w:eastAsia="Times New Roman" w:hAnsi="Times New Roman"/>
+          <w:b w:val="false"/>
+          <w:bCs w:val="false"/>
+          <w:sz w:val="24"/>
+          <w:szCs w:val="24"/>
+        </w:rPr>
+        <w:t xml:space="preserve">Coimbatore – 641 046</w:t>
+      </w:r>
+    </w:p>
+    <w:p>
+      <w:pPr>
+        <w:spacing w:after="0" w:before="0" w:line="276"/>
+        <w:jc w:val="center"/>
+      </w:pPr>
+      <w:r>
+        <w:rPr>
+          <w:rFonts w:ascii="Times New Roman" w:cs="Times New Roman" w:eastAsia="Times New Roman" w:hAnsi="Times New Roman"/>
+          <w:b w:val="false"/>
+          <w:bCs w:val="false"/>
+          <w:sz w:val="24"/>
+          <w:szCs w:val="24"/>
+        </w:rPr>
+        <w:t xml:space="preserve">Academic Year: 2025 – 2026</w:t>
+      </w:r>
+    </w:p>
+    <w:p>
+      <w:r>
+        <w:br w:type="page"/>
+      </w:r>
+    </w:p>
+    <w:p>
+      <w:pPr>
+        <w:spacing w:after="0" w:before="720"/>
+      </w:pPr>
+    </w:p>
+    <w:p>
+      <w:pPr>
+        <w:spacing w:after="480" w:before="0" w:line="276"/>
+        <w:jc w:val="center"/>
+      </w:pPr>
+      <w:r>
+        <w:rPr>
+          <w:rFonts w:ascii="Times New Roman" w:cs="Times New Roman" w:eastAsia="Times New Roman" w:hAnsi="Times New Roman"/>
+          <w:b/>
+          <w:bCs/>
+          <w:sz w:val="28"/>
+          <w:szCs w:val="28"/>
+        </w:rPr>
+        <w:t xml:space="preserve">CERTIFICATE</w:t>
+      </w:r>
+    </w:p>
+    <w:p>
+      <w:pPr>
+        <w:spacing w:after="480" w:before="0" w:line="360"/>
+        <w:jc w:val="both"/>
+      </w:pPr>
+      <w:r>
+        <w:rPr>
+          <w:rFonts w:ascii="Times New Roman" w:cs="Times New Roman" w:eastAsia="Times New Roman" w:hAnsi="Times New Roman"/>
+          <w:b w:val="false"/>
+          <w:bCs w:val="false"/>
+          <w:sz w:val="24"/>
+          <w:szCs w:val="24"/>
+        </w:rPr>
+        <w:t xml:space="preserve">This is to certify that the Mini Project work titled "DITTO — DIGITAL TWIN STUDIO" submitted to Bharathiar University in partial fulfillment of the requirements for the award of the Degree of Master of Computer Applications is a record of the original work done by SANTHOSHKUMAR S (Register No: 241MCAN0014) under my supervision and guidance and that this project work has not formed the basis for the award of any Degree/Diploma/Associateship/Fellowship or similar title to any candidate of any University.</w:t>
+      </w:r>
+    </w:p>
+    <w:p>
+      <w:pPr>
+        <w:spacing w:after="0" w:before="0" w:line="360"/>
+        <w:jc w:val="both"/>
+      </w:pPr>
+      <w:r>
+        <w:rPr>
+          <w:rFonts w:ascii="Times New Roman" w:cs="Times New Roman" w:eastAsia="Times New Roman" w:hAnsi="Times New Roman"/>
+          <w:b w:val="false"/>
+          <w:bCs w:val="false"/>
+          <w:sz w:val="24"/>
+          <w:szCs w:val="24"/>
+        </w:rPr>
+        <w:t xml:space="preserve">Place: Coimbatore</w:t>
+      </w:r>
+    </w:p>
+    <w:p>
+      <w:pPr>
+        <w:spacing w:after="600" w:before="0" w:line="360"/>
+        <w:jc w:val="both"/>
+      </w:pPr>
+      <w:r>
+        <w:rPr>
+          <w:rFonts w:ascii="Times New Roman" w:cs="Times New Roman" w:eastAsia="Times New Roman" w:hAnsi="Times New Roman"/>
+          <w:b w:val="false"/>
+          <w:bCs w:val="false"/>
+          <w:sz w:val="24"/>
+          <w:szCs w:val="24"/>
+        </w:rPr>
+        <w:t xml:space="preserve">Date:</w:t>
+      </w:r>
+    </w:p>
+    <w:p>
+      <w:pPr>
+        <w:spacing w:after="80" w:before="0" w:line="276"/>
+        <w:jc w:val="right"/>
+      </w:pPr>
+      <w:r>
+        <w:rPr>
+          <w:rFonts w:ascii="Times New Roman" w:cs="Times New Roman" w:eastAsia="Times New Roman" w:hAnsi="Times New Roman"/>
+          <w:b w:val="false"/>
+          <w:bCs w:val="false"/>
+          <w:sz w:val="24"/>
+          <w:szCs w:val="24"/>
+        </w:rPr>
+        <w:t xml:space="preserve">Signature of the Guide</w:t>
+      </w:r>
+    </w:p>
+    <w:p>
+      <w:pPr>
+        <w:spacing w:after="80" w:before="0" w:line="276"/>
+        <w:jc w:val="right"/>
+      </w:pPr>
+      <w:r>
+        <w:rPr>
+          <w:rFonts w:ascii="Times New Roman" w:cs="Times New Roman" w:eastAsia="Times New Roman" w:hAnsi="Times New Roman"/>
+          <w:b w:val="false"/>
+          <w:bCs w:val="false"/>
+          <w:sz w:val="24"/>
+          <w:szCs w:val="24"/>
+        </w:rPr>
+        <w:t xml:space="preserve">Dr. D. Saraswathi</w:t>
+      </w:r>
+    </w:p>
+    <w:p>
+      <w:pPr>
+        <w:spacing w:after="80" w:before="0" w:line="276"/>
+        <w:jc w:val="right"/>
+      </w:pPr>
+      <w:r>
+        <w:rPr>
+          <w:rFonts w:ascii="Times New Roman" w:cs="Times New Roman" w:eastAsia="Times New Roman" w:hAnsi="Times New Roman"/>
+          <w:b w:val="false"/>
+          <w:bCs w:val="false"/>
+          <w:sz w:val="24"/>
+          <w:szCs w:val="24"/>
+        </w:rPr>
+        <w:t xml:space="preserve">Associate Professor</w:t>
+      </w:r>
+    </w:p>
+    <w:p>
+      <w:pPr>
+        <w:spacing w:after="80" w:before="0" w:line="276"/>
+        <w:jc w:val="right"/>
+      </w:pPr>
+      <w:r>
+        <w:rPr>
+          <w:rFonts w:ascii="Times New Roman" w:cs="Times New Roman" w:eastAsia="Times New Roman" w:hAnsi="Times New Roman"/>
+          <w:b w:val="false"/>
+          <w:bCs w:val="false"/>
+          <w:sz w:val="24"/>
+          <w:szCs w:val="24"/>
+        </w:rPr>
+        <w:t xml:space="preserve">Department of Computer Science</w:t>
+      </w:r>
+    </w:p>
+    <w:p>
+      <w:pPr>
+        <w:spacing w:after="0" w:before="240" w:line="360"/>
+        <w:jc w:val="both"/>
+      </w:pPr>
+      <w:r>
+        <w:rPr>
+          <w:rFonts w:ascii="Times New Roman" w:cs="Times New Roman" w:eastAsia="Times New Roman" w:hAnsi="Times New Roman"/>
+          <w:b w:val="false"/>
+          <w:bCs w:val="false"/>
+          <w:sz w:val="24"/>
+          <w:szCs w:val="24"/>
+        </w:rPr>
+        <w:t xml:space="preserve">Programme Co-ordinator</w:t>
+      </w:r>
+    </w:p>
+    <w:p>
+      <w:pPr>
+        <w:spacing w:after="480" w:before="0" w:line="360"/>
+        <w:jc w:val="both"/>
+      </w:pPr>
+      <w:r>
+        <w:rPr>
+          <w:rFonts w:ascii="Times New Roman" w:cs="Times New Roman" w:eastAsia="Times New Roman" w:hAnsi="Times New Roman"/>
+          <w:b w:val="false"/>
+          <w:bCs w:val="false"/>
+          <w:sz w:val="24"/>
+          <w:szCs w:val="24"/>
+        </w:rPr>
+        <w:t xml:space="preserve">(with Seal)</w:t>
+      </w:r>
+    </w:p>
+    <w:p>
+      <w:pPr>
+        <w:spacing w:after="0" w:before="0" w:line="360"/>
+        <w:jc w:val="both"/>
+      </w:pPr>
+      <w:r>
+        <w:rPr>
+          <w:rFonts w:ascii="Times New Roman" w:cs="Times New Roman" w:eastAsia="Times New Roman" w:hAnsi="Times New Roman"/>
+          <w:b w:val="false"/>
+          <w:bCs w:val="false"/>
+          <w:sz w:val="24"/>
+          <w:szCs w:val="24"/>
+        </w:rPr>
+        <w:t xml:space="preserve">Forwarded by</w:t>
+      </w:r>
+    </w:p>
+    <w:p>
+      <w:pPr>
+        <w:spacing w:after="0" w:before="0" w:line="360"/>
+        <w:jc w:val="both"/>
+      </w:pPr>
+      <w:r>
+        <w:rPr>
+          <w:rFonts w:ascii="Times New Roman" w:cs="Times New Roman" w:eastAsia="Times New Roman" w:hAnsi="Times New Roman"/>
+          <w:b w:val="false"/>
+          <w:bCs w:val="false"/>
+          <w:sz w:val="24"/>
+          <w:szCs w:val="24"/>
+        </w:rPr>
+        <w:t xml:space="preserve">Director</w:t>
+      </w:r>
+    </w:p>
+    <w:p>
+      <w:pPr>
+        <w:spacing w:after="0" w:before="0" w:line="360"/>
+        <w:jc w:val="both"/>
+      </w:pPr>
+      <w:r>
+        <w:rPr>
+          <w:rFonts w:ascii="Times New Roman" w:cs="Times New Roman" w:eastAsia="Times New Roman" w:hAnsi="Times New Roman"/>
+          <w:b w:val="false"/>
+          <w:bCs w:val="false"/>
+          <w:sz w:val="24"/>
+          <w:szCs w:val="24"/>
+        </w:rPr>
+        <w:t xml:space="preserve">Centre for Distance and Online Education</w:t>
+      </w:r>
+    </w:p>
+    <w:p>
+      <w:pPr>
+        <w:spacing w:after="0" w:before="0" w:line="360"/>
+        <w:jc w:val="both"/>
+      </w:pPr>
+      <w:r>
+        <w:rPr>
+          <w:rFonts w:ascii="Times New Roman" w:cs="Times New Roman" w:eastAsia="Times New Roman" w:hAnsi="Times New Roman"/>
+          <w:b w:val="false"/>
+          <w:bCs w:val="false"/>
+          <w:sz w:val="24"/>
+          <w:szCs w:val="24"/>
+        </w:rPr>
+        <w:t xml:space="preserve">Bharathiar University</w:t>
+      </w:r>
+    </w:p>
+    <w:p>
+      <w:pPr>
+        <w:spacing w:after="80" w:before="0" w:line="360"/>
+        <w:jc w:val="both"/>
+      </w:pPr>
+      <w:r>
+        <w:rPr>
+          <w:rFonts w:ascii="Times New Roman" w:cs="Times New Roman" w:eastAsia="Times New Roman" w:hAnsi="Times New Roman"/>
+          <w:b w:val="false"/>
+          <w:bCs w:val="false"/>
+          <w:sz w:val="24"/>
+          <w:szCs w:val="24"/>
+        </w:rPr>
+        <w:t xml:space="preserve">Coimbatore – 641 046</w:t>
+      </w:r>
+    </w:p>
+    <w:p>
+      <w:r>
+        <w:br w:type="page"/>
+      </w:r>
+    </w:p>
+    <w:p>
+      <w:pPr>
+        <w:spacing w:after="0" w:before="720"/>
+      </w:pPr>
+    </w:p>
+    <w:p>
+      <w:pPr>
+        <w:spacing w:after="480" w:before="0" w:line="276"/>
+        <w:jc w:val="center"/>
+      </w:pPr>
+      <w:r>
+        <w:rPr>
+          <w:rFonts w:ascii="Times New Roman" w:cs="Times New Roman" w:eastAsia="Times New Roman" w:hAnsi="Times New Roman"/>
+          <w:b/>
+          <w:bCs/>
+          <w:sz w:val="28"/>
+          <w:szCs w:val="28"/>
+        </w:rPr>
+        <w:t xml:space="preserve">DECLARATION</w:t>
+      </w:r>
+    </w:p>
+    <w:p>
+      <w:pPr>
+        <w:spacing w:after="600" w:before="0" w:line="360"/>
+        <w:jc w:val="both"/>
+      </w:pPr>
+      <w:r>
+        <w:rPr>
+          <w:rFonts w:ascii="Times New Roman" w:cs="Times New Roman" w:eastAsia="Times New Roman" w:hAnsi="Times New Roman"/>
+          <w:b w:val="false"/>
+          <w:bCs w:val="false"/>
+          <w:sz w:val="24"/>
+          <w:szCs w:val="24"/>
+        </w:rPr>
+        <w:t xml:space="preserve">I hereby declare that this project work titled "DITTO — DIGITAL TWIN STUDIO" submitted to the Centre for Distance and Online Education, Bharathiar University is a record of original work done by SANTHOSHKUMAR S under the supervision and guidance of Dr. D. Saraswathi and that this project work has not formed the basis for the award of any Degree/Diploma/Associateship/Fellowship or similar title to any candidate of any University.</w:t>
+      </w:r>
+    </w:p>
+    <w:p>
+      <w:pPr>
+        <w:spacing w:after="80" w:before="0" w:line="276"/>
+        <w:jc w:val="right"/>
+      </w:pPr>
+      <w:r>
+        <w:rPr>
+          <w:rFonts w:ascii="Times New Roman" w:cs="Times New Roman" w:eastAsia="Times New Roman" w:hAnsi="Times New Roman"/>
+          <w:b w:val="false"/>
+          <w:bCs w:val="false"/>
+          <w:sz w:val="24"/>
+          <w:szCs w:val="24"/>
+        </w:rPr>
+        <w:t xml:space="preserve">SANTHOSHKUMAR S</w:t>
+      </w:r>
+    </w:p>
+    <w:p>
+      <w:pPr>
+        <w:spacing w:after="80" w:before="0" w:line="276"/>
+        <w:jc w:val="right"/>
+      </w:pPr>
+      <w:r>
+        <w:rPr>
+          <w:rFonts w:ascii="Times New Roman" w:cs="Times New Roman" w:eastAsia="Times New Roman" w:hAnsi="Times New Roman"/>
+          <w:b/>
+          <w:bCs/>
+          <w:sz w:val="24"/>
+          <w:szCs w:val="24"/>
+        </w:rPr>
+        <w:t xml:space="preserve">Signature of the candidate</w:t>
+      </w:r>
+    </w:p>
+    <w:tbl>
+      <w:tblPr>
+        <w:tblW w:type="auto" w:w="9360"/>
+        <w:tblBorders>
+          <w:top w:val="single" w:color="auto" w:sz="4"/>
+          <w:left w:val="single" w:color="auto" w:sz="4"/>
+          <w:bottom w:val="single" w:color="auto" w:sz="4"/>
+          <w:right w:val="single" w:color="auto" w:sz="4"/>
+          <w:insideH w:val="single" w:color="auto" w:sz="4"/>
+          <w:insideV w:val="single" w:color="auto" w:sz="4"/>
+        </w:tblBorders>
+      </w:tblPr>
+      <w:tblGrid>
+        <w:gridCol w:w="2800"/>
+        <w:gridCol w:w="6560"/>
+      </w:tblGrid>
+      <w:tr>
+        <w:tc>
+          <w:tcPr>
+            <w:tcBorders>
+              <w:top w:val="none" w:color="FFFFFF" w:sz="0"/>
+              <w:left w:val="none" w:color="FFFFFF" w:sz="0"/>
+              <w:bottom w:val="none" w:color="FFFFFF" w:sz="0"/>
+              <w:right w:val="none" w:color="FFFFFF" w:sz="0"/>
+            </w:tcBorders>
+            <w:tcMar>
+              <w:top w:type="dxa" w:w="60"/>
+              <w:left w:type="dxa" w:w="0"/>
+              <w:bottom w:type="dxa" w:w="60"/>
+              <w:right w:type="dxa" w:w="120"/>
+            </w:tcMar>
+          </w:tcPr>
+          <w:p>
+            <w:r>
+              <w:rPr>
+                <w:rFonts w:ascii="Times New Roman" w:cs="Times New Roman" w:eastAsia="Times New Roman" w:hAnsi="Times New Roman"/>
+                <w:sz w:val="22"/>
+                <w:szCs w:val="22"/>
+              </w:rPr>
+              <w:t xml:space="preserve">Name</w:t>
+            </w:r>
+          </w:p>
+        </w:tc>
+        <w:tc>
+          <w:tcPr>
+            <w:tcBorders>
+              <w:top w:val="none" w:color="FFFFFF" w:sz="0"/>
+              <w:left w:val="none" w:color="FFFFFF" w:sz="0"/>
+              <w:bottom w:val="none" w:color="FFFFFF" w:sz="0"/>
+              <w:right w:val="none" w:color="FFFFFF" w:sz="0"/>
+            </w:tcBorders>
+            <w:tcMar>
+              <w:top w:type="dxa" w:w="60"/>
+              <w:left w:type="dxa" w:w="0"/>
+              <w:bottom w:type="dxa" w:w="60"/>
+              <w:right w:type="dxa" w:w="0"/>
+            </w:tcMar>
+          </w:tcPr>
+          <w:p>
+            <w:r>
+              <w:rPr>
+                <w:rFonts w:ascii="Times New Roman" w:cs="Times New Roman" w:eastAsia="Times New Roman" w:hAnsi="Times New Roman"/>
+                <w:sz w:val="22"/>
+                <w:szCs w:val="22"/>
+              </w:rPr>
+              <w:t xml:space="preserve">: SANTHOSHKUMAR S</w:t>
+            </w:r>
+          </w:p>
+        </w:tc>
+      </w:tr>
+      <w:tr>
+        <w:tc>
+          <w:tcPr>
+            <w:tcBorders>
+              <w:top w:val="none" w:color="FFFFFF" w:sz="0"/>
+              <w:left w:val="none" w:color="FFFFFF" w:sz="0"/>
+              <w:bottom w:val="none" w:color="FFFFFF" w:sz="0"/>
+              <w:right w:val="none" w:color="FFFFFF" w:sz="0"/>
+            </w:tcBorders>
+            <w:tcMar>
+              <w:top w:type="dxa" w:w="60"/>
+              <w:left w:type="dxa" w:w="0"/>
+              <w:bottom w:type="dxa" w:w="60"/>
+              <w:right w:type="dxa" w:w="120"/>
+            </w:tcMar>
+          </w:tcPr>
+          <w:p>
+            <w:r>
+              <w:rPr>
+                <w:rFonts w:ascii="Times New Roman" w:cs="Times New Roman" w:eastAsia="Times New Roman" w:hAnsi="Times New Roman"/>
+                <w:sz w:val="22"/>
+                <w:szCs w:val="22"/>
+              </w:rPr>
+              <w:t xml:space="preserve">Enrolment No</w:t>
+            </w:r>
+          </w:p>
+        </w:tc>
+        <w:tc>
+          <w:tcPr>
+            <w:tcBorders>
+              <w:top w:val="none" w:color="FFFFFF" w:sz="0"/>
+              <w:left w:val="none" w:color="FFFFFF" w:sz="0"/>
+              <w:bottom w:val="none" w:color="FFFFFF" w:sz="0"/>
+              <w:right w:val="none" w:color="FFFFFF" w:sz="0"/>
+            </w:tcBorders>
+            <w:tcMar>
+              <w:top w:type="dxa" w:w="60"/>
+              <w:left w:type="dxa" w:w="0"/>
+              <w:bottom w:type="dxa" w:w="60"/>
+              <w:right w:type="dxa" w:w="0"/>
+            </w:tcMar>
+          </w:tcPr>
+          <w:p>
+            <w:r>
+              <w:rPr>
+                <w:rFonts w:ascii="Times New Roman" w:cs="Times New Roman" w:eastAsia="Times New Roman" w:hAnsi="Times New Roman"/>
+                <w:sz w:val="22"/>
+                <w:szCs w:val="22"/>
+              </w:rPr>
+              <w:t xml:space="preserve">: 241MCAN0014</w:t>
+            </w:r>
+          </w:p>
+        </w:tc>
+      </w:tr>
+      <w:tr>
+        <w:tc>
+          <w:tcPr>
+            <w:tcBorders>
+              <w:top w:val="none" w:color="FFFFFF" w:sz="0"/>
+              <w:left w:val="none" w:color="FFFFFF" w:sz="0"/>
+              <w:bottom w:val="none" w:color="FFFFFF" w:sz="0"/>
+              <w:right w:val="none" w:color="FFFFFF" w:sz="0"/>
+            </w:tcBorders>
+            <w:tcMar>
+              <w:top w:type="dxa" w:w="60"/>
+              <w:left w:type="dxa" w:w="0"/>
+              <w:bottom w:type="dxa" w:w="60"/>
+              <w:right w:type="dxa" w:w="120"/>
+            </w:tcMar>
+          </w:tcPr>
+          <w:p>
+            <w:r>
+              <w:rPr>
+                <w:rFonts w:ascii="Times New Roman" w:cs="Times New Roman" w:eastAsia="Times New Roman" w:hAnsi="Times New Roman"/>
+                <w:sz w:val="22"/>
+                <w:szCs w:val="22"/>
+              </w:rPr>
+              <w:t xml:space="preserve">Register No</w:t>
+            </w:r>
+          </w:p>
+        </w:tc>
+        <w:tc>
+          <w:tcPr>
+            <w:tcBorders>
+              <w:top w:val="none" w:color="FFFFFF" w:sz="0"/>
+              <w:left w:val="none" w:color="FFFFFF" w:sz="0"/>
+              <w:bottom w:val="none" w:color="FFFFFF" w:sz="0"/>
+              <w:right w:val="none" w:color="FFFFFF" w:sz="0"/>
+            </w:tcBorders>
+            <w:tcMar>
+              <w:top w:type="dxa" w:w="60"/>
+              <w:left w:type="dxa" w:w="0"/>
+              <w:bottom w:type="dxa" w:w="60"/>
+              <w:right w:type="dxa" w:w="0"/>
+            </w:tcMar>
+          </w:tcPr>
+          <w:p>
+            <w:r>
+              <w:rPr>
+                <w:rFonts w:ascii="Times New Roman" w:cs="Times New Roman" w:eastAsia="Times New Roman" w:hAnsi="Times New Roman"/>
+                <w:sz w:val="22"/>
+                <w:szCs w:val="22"/>
+              </w:rPr>
+              <w:t xml:space="preserve">: 241MCAN0014</w:t>
+            </w:r>
+          </w:p>
+        </w:tc>
+      </w:tr>
+      <w:tr>
+        <w:tc>
+          <w:tcPr>
+            <w:tcBorders>
+              <w:top w:val="none" w:color="FFFFFF" w:sz="0"/>
+              <w:left w:val="none" w:color="FFFFFF" w:sz="0"/>
+              <w:bottom w:val="none" w:color="FFFFFF" w:sz="0"/>
+              <w:right w:val="none" w:color="FFFFFF" w:sz="0"/>
+            </w:tcBorders>
+            <w:tcMar>
+              <w:top w:type="dxa" w:w="60"/>
+              <w:left w:type="dxa" w:w="0"/>
+              <w:bottom w:type="dxa" w:w="60"/>
+              <w:right w:type="dxa" w:w="120"/>
+            </w:tcMar>
+          </w:tcPr>
+          <w:p>
+            <w:r>
+              <w:rPr>
+                <w:rFonts w:ascii="Times New Roman" w:cs="Times New Roman" w:eastAsia="Times New Roman" w:hAnsi="Times New Roman"/>
+                <w:sz w:val="22"/>
+                <w:szCs w:val="22"/>
+              </w:rPr>
+              <w:t xml:space="preserve">Course</w:t>
+            </w:r>
+          </w:p>
+        </w:tc>
+        <w:tc>
+          <w:tcPr>
+            <w:tcBorders>
+              <w:top w:val="none" w:color="FFFFFF" w:sz="0"/>
+              <w:left w:val="none" w:color="FFFFFF" w:sz="0"/>
+              <w:bottom w:val="none" w:color="FFFFFF" w:sz="0"/>
+              <w:right w:val="none" w:color="FFFFFF" w:sz="0"/>
+            </w:tcBorders>
+            <w:tcMar>
+              <w:top w:type="dxa" w:w="60"/>
+              <w:left w:type="dxa" w:w="0"/>
+              <w:bottom w:type="dxa" w:w="60"/>
+              <w:right w:type="dxa" w:w="0"/>
+            </w:tcMar>
+          </w:tcPr>
+          <w:p>
+            <w:r>
+              <w:rPr>
+                <w:rFonts w:ascii="Times New Roman" w:cs="Times New Roman" w:eastAsia="Times New Roman" w:hAnsi="Times New Roman"/>
+                <w:sz w:val="22"/>
+                <w:szCs w:val="22"/>
+              </w:rPr>
+              <w:t xml:space="preserve">: Master of Computer Applications (MCA)</w:t>
+            </w:r>
+          </w:p>
+        </w:tc>
+      </w:tr>
+      <w:tr>
+        <w:tc>
+          <w:tcPr>
+            <w:tcBorders>
+              <w:top w:val="none" w:color="FFFFFF" w:sz="0"/>
+              <w:left w:val="none" w:color="FFFFFF" w:sz="0"/>
+              <w:bottom w:val="none" w:color="FFFFFF" w:sz="0"/>
+              <w:right w:val="none" w:color="FFFFFF" w:sz="0"/>
+            </w:tcBorders>
+            <w:tcMar>
+              <w:top w:type="dxa" w:w="60"/>
+              <w:left w:type="dxa" w:w="0"/>
+              <w:bottom w:type="dxa" w:w="60"/>
+              <w:right w:type="dxa" w:w="120"/>
+            </w:tcMar>
+          </w:tcPr>
+          <w:p>
+            <w:r>
+              <w:rPr>
+                <w:rFonts w:ascii="Times New Roman" w:cs="Times New Roman" w:eastAsia="Times New Roman" w:hAnsi="Times New Roman"/>
+                <w:sz w:val="22"/>
+                <w:szCs w:val="22"/>
+              </w:rPr>
+              <w:t xml:space="preserve">Place</w:t>
+            </w:r>
+          </w:p>
+        </w:tc>
+        <w:tc>
+          <w:tcPr>
+            <w:tcBorders>
+              <w:top w:val="none" w:color="FFFFFF" w:sz="0"/>
+              <w:left w:val="none" w:color="FFFFFF" w:sz="0"/>
+              <w:bottom w:val="none" w:color="FFFFFF" w:sz="0"/>
+              <w:right w:val="none" w:color="FFFFFF" w:sz="0"/>
+            </w:tcBorders>
+            <w:tcMar>
+              <w:top w:type="dxa" w:w="60"/>
+              <w:left w:type="dxa" w:w="0"/>
+              <w:bottom w:type="dxa" w:w="60"/>
+              <w:right w:type="dxa" w:w="0"/>
+            </w:tcMar>
+          </w:tcPr>
+          <w:p>
+            <w:r>
+              <w:rPr>
+                <w:rFonts w:ascii="Times New Roman" w:cs="Times New Roman" w:eastAsia="Times New Roman" w:hAnsi="Times New Roman"/>
+                <w:sz w:val="22"/>
+                <w:szCs w:val="22"/>
+              </w:rPr>
+              <w:t xml:space="preserve">: Coimbatore</w:t>
+            </w:r>
+          </w:p>
+        </w:tc>
+      </w:tr>
+      <w:tr>
+        <w:tc>
+          <w:tcPr>
+            <w:tcBorders>
+              <w:top w:val="none" w:color="FFFFFF" w:sz="0"/>
+              <w:left w:val="none" w:color="FFFFFF" w:sz="0"/>
+              <w:bottom w:val="none" w:color="FFFFFF" w:sz="0"/>
+              <w:right w:val="none" w:color="FFFFFF" w:sz="0"/>
+            </w:tcBorders>
+            <w:tcMar>
+              <w:top w:type="dxa" w:w="60"/>
+              <w:left w:type="dxa" w:w="0"/>
+              <w:bottom w:type="dxa" w:w="60"/>
+              <w:right w:type="dxa" w:w="120"/>
+            </w:tcMar>
+          </w:tcPr>
+          <w:p>
+            <w:r>
+              <w:rPr>
+                <w:rFonts w:ascii="Times New Roman" w:cs="Times New Roman" w:eastAsia="Times New Roman" w:hAnsi="Times New Roman"/>
+                <w:sz w:val="22"/>
+                <w:szCs w:val="22"/>
+              </w:rPr>
+              <w:t xml:space="preserve">Date</w:t>
+            </w:r>
+          </w:p>
+        </w:tc>
+        <w:tc>
+          <w:tcPr>
+            <w:tcBorders>
+              <w:top w:val="none" w:color="FFFFFF" w:sz="0"/>
+              <w:left w:val="none" w:color="FFFFFF" w:sz="0"/>
+              <w:bottom w:val="none" w:color="FFFFFF" w:sz="0"/>
+              <w:right w:val="none" w:color="FFFFFF" w:sz="0"/>
+            </w:tcBorders>
+            <w:tcMar>
+              <w:top w:type="dxa" w:w="60"/>
+              <w:left w:type="dxa" w:w="0"/>
+              <w:bottom w:type="dxa" w:w="60"/>
+              <w:right w:type="dxa" w:w="0"/>
+            </w:tcMar>
+          </w:tcPr>
+          <w:p>
+            <w:r>
+              <w:rPr>
+                <w:rFonts w:ascii="Times New Roman" w:cs="Times New Roman" w:eastAsia="Times New Roman" w:hAnsi="Times New Roman"/>
+                <w:sz w:val="22"/>
+                <w:szCs w:val="22"/>
+              </w:rPr>
+              <w:t xml:space="preserve">: </w:t>
+            </w:r>
+          </w:p>
+        </w:tc>
+      </w:tr>
+    </w:tbl>
+    <w:p>
+      <w:pPr>
+        <w:spacing w:after="0" w:before="480"/>
+      </w:pPr>
+    </w:p>
+    <w:tbl>
+      <w:tblPr>
+        <w:tblW w:type="dxa" w:w="9360"/>
+        <w:tblBorders>
+          <w:top w:val="single" w:color="auto" w:sz="4"/>
+          <w:left w:val="single" w:color="auto" w:sz="4"/>
+          <w:bottom w:val="single" w:color="auto" w:sz="4"/>
+          <w:right w:val="single" w:color="auto" w:sz="4"/>
+          <w:insideH w:val="single" w:color="auto" w:sz="4"/>
+          <w:insideV w:val="single" w:color="auto" w:sz="4"/>
+        </w:tblBorders>
+      </w:tblPr>
+      <w:tblGrid>
+        <w:gridCol w:w="4680"/>
+        <w:gridCol w:w="4680"/>
+      </w:tblGrid>
+      <w:tr>
+        <w:tc>
+          <w:tcPr>
+            <w:tcBorders>
+              <w:top w:val="none" w:color="FFFFFF" w:sz="0"/>
+              <w:left w:val="none" w:color="FFFFFF" w:sz="0"/>
+              <w:bottom w:val="none" w:color="FFFFFF" w:sz="0"/>
+              <w:right w:val="none" w:color="FFFFFF" w:sz="0"/>
+            </w:tcBorders>
+            <w:tcMar>
+              <w:top w:type="dxa" w:w="80"/>
+              <w:left w:type="dxa" w:w="0"/>
+              <w:bottom w:type="dxa" w:w="0"/>
+              <w:right w:type="dxa" w:w="0"/>
+            </w:tcMar>
+          </w:tcPr>
+          <w:p>
+            <w:r>
+              <w:rPr>
+                <w:rFonts w:ascii="Times New Roman" w:cs="Times New Roman" w:eastAsia="Times New Roman" w:hAnsi="Times New Roman"/>
+                <w:sz w:val="22"/>
+                <w:szCs w:val="22"/>
+              </w:rPr>
+              <w:t xml:space="preserve">Signature of the Guide</w:t>
+            </w:r>
+          </w:p>
+        </w:tc>
+        <w:tc>
+          <w:tcPr>
+            <w:tcBorders>
+              <w:top w:val="none" w:color="FFFFFF" w:sz="0"/>
+              <w:left w:val="none" w:color="FFFFFF" w:sz="0"/>
+              <w:bottom w:val="none" w:color="FFFFFF" w:sz="0"/>
+              <w:right w:val="none" w:color="FFFFFF" w:sz="0"/>
+            </w:tcBorders>
+            <w:tcMar>
+              <w:top w:type="dxa" w:w="80"/>
+              <w:left w:type="dxa" w:w="0"/>
+              <w:bottom w:type="dxa" w:w="0"/>
+              <w:right w:type="dxa" w:w="0"/>
+            </w:tcMar>
+          </w:tcPr>
+          <w:p>
+            <w:pPr>
+              <w:jc w:val="right"/>
+            </w:pPr>
+            <w:r>
+              <w:rPr>
+                <w:rFonts w:ascii="Times New Roman" w:cs="Times New Roman" w:eastAsia="Times New Roman" w:hAnsi="Times New Roman"/>
+                <w:sz w:val="22"/>
+                <w:szCs w:val="22"/>
+              </w:rPr>
+              <w:t xml:space="preserve">Countersigned by the Co-ordinator</w:t>
+            </w:r>
+          </w:p>
+        </w:tc>
+      </w:tr>
+      <w:tr>
+        <w:tc>
+          <w:tcPr>
+            <w:tcBorders>
+              <w:top w:val="none" w:color="FFFFFF" w:sz="0"/>
+              <w:left w:val="none" w:color="FFFFFF" w:sz="0"/>
+              <w:bottom w:val="none" w:color="FFFFFF" w:sz="0"/>
+              <w:right w:val="none" w:color="FFFFFF" w:sz="0"/>
+            </w:tcBorders>
+            <w:tcMar>
+              <w:top w:type="dxa" w:w="0"/>
+              <w:left w:type="dxa" w:w="0"/>
+              <w:bottom w:type="dxa" w:w="80"/>
+              <w:right w:type="dxa" w:w="0"/>
+            </w:tcMar>
+          </w:tcPr>
+          <w:p>
+            <w:r>
+              <w:rPr>
+                <w:rFonts w:ascii="Times New Roman" w:cs="Times New Roman" w:eastAsia="Times New Roman" w:hAnsi="Times New Roman"/>
+                <w:sz w:val="22"/>
+                <w:szCs w:val="22"/>
+              </w:rPr>
+              <w:t xml:space="preserve">(With seal)</w:t>
+            </w:r>
+          </w:p>
+        </w:tc>
+        <w:tc>
+          <w:tcPr>
+            <w:tcBorders>
+              <w:top w:val="none" w:color="FFFFFF" w:sz="0"/>
+              <w:left w:val="none" w:color="FFFFFF" w:sz="0"/>
+              <w:bottom w:val="none" w:color="FFFFFF" w:sz="0"/>
+              <w:right w:val="none" w:color="FFFFFF" w:sz="0"/>
+            </w:tcBorders>
+            <w:tcMar>
+              <w:top w:type="dxa" w:w="0"/>
+              <w:left w:type="dxa" w:w="0"/>
+              <w:bottom w:type="dxa" w:w="80"/>
+              <w:right w:type="dxa" w:w="0"/>
+            </w:tcMar>
+          </w:tcPr>
+          <w:p>
+            <w:pPr>
+              <w:jc w:val="right"/>
+            </w:pPr>
+            <w:r>
+              <w:rPr>
+                <w:rFonts w:ascii="Times New Roman" w:cs="Times New Roman" w:eastAsia="Times New Roman" w:hAnsi="Times New Roman"/>
+                <w:sz w:val="22"/>
+                <w:szCs w:val="22"/>
+              </w:rPr>
+              <w:t xml:space="preserve">(With Seal)</w:t>
+            </w:r>
+          </w:p>
+        </w:tc>
+      </w:tr>
+    </w:tbl>
+    <w:p>
+      <w:r>
+        <w:br w:type="page"/>
+      </w:r>
+    </w:p>
+    <w:p>
+      <w:pPr>
+        <w:spacing w:after="0" w:before="720"/>
+      </w:pPr>
+    </w:p>
+    <w:p>
+      <w:pPr>
+        <w:spacing w:after="480" w:before="0" w:line="276"/>
+        <w:jc w:val="center"/>
+      </w:pPr>
+      <w:r>
+        <w:rPr>
+          <w:rFonts w:ascii="Times New Roman" w:cs="Times New Roman" w:eastAsia="Times New Roman" w:hAnsi="Times New Roman"/>
+          <w:b/>
+          <w:bCs/>
+          <w:sz w:val="28"/>
+          <w:szCs w:val="28"/>
+        </w:rPr>
+        <w:t xml:space="preserve">ACKNOWLEDGEMENT</w:t>
+      </w:r>
+    </w:p>
+    <w:p>
+      <w:pPr>
+        <w:spacing w:after="240" w:before="0" w:line="360"/>
+        <w:jc w:val="both"/>
+      </w:pPr>
+      <w:r>
+        <w:rPr>
+          <w:rFonts w:ascii="Times New Roman" w:cs="Times New Roman" w:eastAsia="Times New Roman" w:hAnsi="Times New Roman"/>
+          <w:b w:val="false"/>
+          <w:bCs w:val="false"/>
+          <w:sz w:val="24"/>
+          <w:szCs w:val="24"/>
+        </w:rPr>
+        <w:t xml:space="preserve">I express my sincere and heartfelt gratitude to Bharathiar University, Coimbatore, for providing me the opportunity to undertake this Mini Project as part of the Master of Computer Applications programme.</w:t>
+      </w:r>
+    </w:p>
+    <w:p>
+      <w:pPr>
+        <w:spacing w:after="240" w:before="0" w:line="360"/>
+        <w:jc w:val="both"/>
+      </w:pPr>
+      <w:r>
+        <w:rPr>
+          <w:rFonts w:ascii="Times New Roman" w:cs="Times New Roman" w:eastAsia="Times New Roman" w:hAnsi="Times New Roman"/>
+          <w:b w:val="false"/>
+          <w:bCs w:val="false"/>
+          <w:sz w:val="24"/>
+          <w:szCs w:val="24"/>
+        </w:rPr>
+        <w:t xml:space="preserve">I wish to express my deep sense of gratitude to my guide, Dr. D. Saraswathi, Associate Professor, Department of Computer Science, for her valuable guidance, continuous encouragement, constructive suggestions and constant support throughout the completion of this project work titled "DITTO — DIGITAL TWIN STUDIO".</w:t>
+      </w:r>
+    </w:p>
+    <w:p>
+      <w:pPr>
+        <w:spacing w:after="240" w:before="0" w:line="360"/>
+        <w:jc w:val="both"/>
+      </w:pPr>
+      <w:r>
+        <w:rPr>
+          <w:rFonts w:ascii="Times New Roman" w:cs="Times New Roman" w:eastAsia="Times New Roman" w:hAnsi="Times New Roman"/>
+          <w:b w:val="false"/>
+          <w:bCs w:val="false"/>
+          <w:sz w:val="24"/>
+          <w:szCs w:val="24"/>
+        </w:rPr>
+        <w:t xml:space="preserve">I extend my thanks to the Programme Co-ordinator and the faculty members of the Department for their support and encouragement during the course of this project.</w:t>
+      </w:r>
+    </w:p>
+    <w:p>
+      <w:pPr>
+        <w:spacing w:after="480" w:before="0" w:line="360"/>
+        <w:jc w:val="both"/>
+      </w:pPr>
+      <w:r>
+        <w:rPr>
+          <w:rFonts w:ascii="Times New Roman" w:cs="Times New Roman" w:eastAsia="Times New Roman" w:hAnsi="Times New Roman"/>
+          <w:b w:val="false"/>
+          <w:bCs w:val="false"/>
+          <w:sz w:val="24"/>
+          <w:szCs w:val="24"/>
+        </w:rPr>
+        <w:t xml:space="preserve">I also thank my family and friends for their moral support, motivation and encouragement which helped me to successfully complete this project.</w:t>
+      </w:r>
+    </w:p>
+    <w:p>
+      <w:pPr>
+        <w:spacing w:after="0" w:before="0" w:line="360"/>
+        <w:jc w:val="both"/>
+      </w:pPr>
+      <w:r>
+        <w:rPr>
+          <w:rFonts w:ascii="Times New Roman" w:cs="Times New Roman" w:eastAsia="Times New Roman" w:hAnsi="Times New Roman"/>
+          <w:b w:val="false"/>
+          <w:bCs w:val="false"/>
+          <w:sz w:val="24"/>
+          <w:szCs w:val="24"/>
+        </w:rPr>
+        <w:t xml:space="preserve">Place: Coimbatore</w:t>
+      </w:r>
+    </w:p>
+    <w:p>
+      <w:pPr>
+        <w:spacing w:after="600" w:before="0" w:line="360"/>
+        <w:jc w:val="both"/>
+      </w:pPr>
+      <w:r>
+        <w:rPr>
+          <w:rFonts w:ascii="Times New Roman" w:cs="Times New Roman" w:eastAsia="Times New Roman" w:hAnsi="Times New Roman"/>
+          <w:b w:val="false"/>
+          <w:bCs w:val="false"/>
+          <w:sz w:val="24"/>
+          <w:szCs w:val="24"/>
+        </w:rPr>
+        <w:t xml:space="preserve">Date:</w:t>
+      </w:r>
+    </w:p>
+    <w:p>
+      <w:pPr>
+        <w:spacing w:after="80" w:before="0" w:line="276"/>
+        <w:jc w:val="right"/>
+      </w:pPr>
+      <w:r>
+        <w:rPr>
+          <w:rFonts w:ascii="Times New Roman" w:cs="Times New Roman" w:eastAsia="Times New Roman" w:hAnsi="Times New Roman"/>
+          <w:b w:val="false"/>
+          <w:bCs w:val="false"/>
+          <w:sz w:val="24"/>
+          <w:szCs w:val="24"/>
+        </w:rPr>
+        <w:t xml:space="preserve">SANTHOSHKUMAR S</w:t>
+      </w:r>
+    </w:p>
+    <w:p>
+      <w:pPr>
+        <w:spacing w:after="80" w:before="0" w:line="276"/>
+        <w:jc w:val="right"/>
+      </w:pPr>
+      <w:r>
+        <w:rPr>
+          <w:rFonts w:ascii="Times New Roman" w:cs="Times New Roman" w:eastAsia="Times New Roman" w:hAnsi="Times New Roman"/>
+          <w:b w:val="false"/>
+          <w:bCs w:val="false"/>
+          <w:sz w:val="24"/>
+          <w:szCs w:val="24"/>
+        </w:rPr>
+        <w:t xml:space="preserve">241MCAN0014</w:t>
+      </w:r>
+    </w:p>
+    <w:p>
+      <w:pPr>
+        <w:sectPr>
+          <w:pgSz w:w="12240" w:h="15840" w:orient="portrait"/>
+          <w:pgMar w:top="1440" w:right="1440" w:bottom="1440" w:left="1440" w:header="708" w:footer="708" w:gutter="0"/>
+          <w:pgNumType/>
+          <w:docGrid w:linePitch="360"/>
+        </w:sectPr>
+      </w:pPr>
+    </w:p>
     <w:p>
       <w:pPr>
         <w:spacing w:after="0" w:before="1440"/>

</xml_diff>